<commit_message>
docs: entrega da iteração 1 com URL publicada e capturas da versão em produção
Co-Authored-By: Claude Opus 5.5 <noreply@anthropic.com>
</commit_message>
<xml_diff>
--- a/docs/entrega/SalaoAgenda_Entrega_Iteracao1.docx
+++ b/docs/entrega/SalaoAgenda_Entrega_Iteracao1.docx
@@ -682,11 +682,12 @@
             </w:pPr>
             <w:r>
               <w:rPr>
-                <w:i/>
-                <w:iCs/>
-                <w:color w:val="666666"/>
-              </w:rPr>
-              <w:t xml:space="preserve">[inserir URL da aplicação na Vercel]</w:t>
+                <w:b w:val="false"/>
+                <w:bCs w:val="false"/>
+                <w:sz w:val="20"/>
+                <w:szCs w:val="20"/>
+              </w:rPr>
+              <w:t>https://salao-agenda-aula.vercel.app</w:t>
             </w:r>
           </w:p>
         </w:tc>
@@ -1136,19 +1137,10 @@
         <w:spacing w:after="80" w:line="320"/>
       </w:pPr>
       <w:r>
-        <w:t xml:space="preserve">Digite na barra de endereços: </w:t>
-      </w:r>
-      <w:r>
-        <w:rPr>
-          <w:i/>
-          <w:iCs/>
-          <w:color w:val="666666"/>
-        </w:rPr>
-        <w:t xml:space="preserve">[inserir URL da aplicação]</w:t>
-      </w:r>
-      <w:r>
-        <w:t xml:space="preserve">.</w:t>
-      </w:r>
+        <w:t>Digite na barra de endereços: https://salao-agenda-aula.vercel.app.</w:t>
+      </w:r>
+      <w:r/>
+      <w:r/>
     </w:p>
     <w:p>
       <w:pPr>
@@ -1727,7 +1719,40 @@
                 <w:iCs/>
                 <w:color w:val="666666"/>
               </w:rPr>
-              <w:t xml:space="preserve">[Inserir aqui a captura da tela de consulta de horários da versão publicada]</w:t>
+            </w:r>
+            <w:r>
+              <w:drawing>
+                <wp:inline xmlns:a="http://schemas.openxmlformats.org/drawingml/2006/main" xmlns:pic="http://schemas.openxmlformats.org/drawingml/2006/picture">
+                  <wp:extent cx="5040000" cy="3740625"/>
+                  <wp:docPr id="2" name="Picture 2"/>
+                  <wp:cNvGraphicFramePr>
+                    <a:graphicFrameLocks noChangeAspect="1"/>
+                  </wp:cNvGraphicFramePr>
+                  <a:graphic>
+                    <a:graphicData uri="http://schemas.openxmlformats.org/drawingml/2006/picture">
+                      <pic:pic>
+                        <pic:nvPicPr>
+                          <pic:cNvPr id="0" name="figura-1-consulta.png"/>
+                          <pic:cNvPicPr/>
+                        </pic:nvPicPr>
+                        <pic:blipFill>
+                          <a:blip r:embed="rId11"/>
+                          <a:stretch>
+                            <a:fillRect/>
+                          </a:stretch>
+                        </pic:blipFill>
+                        <pic:spPr>
+                          <a:xfrm>
+                            <a:off x="0" y="0"/>
+                            <a:ext cx="5040000" cy="3740625"/>
+                          </a:xfrm>
+                          <a:prstGeom prst="rect"/>
+                        </pic:spPr>
+                      </pic:pic>
+                    </a:graphicData>
+                  </a:graphic>
+                </wp:inline>
+              </w:drawing>
             </w:r>
           </w:p>
         </w:tc>
@@ -1871,7 +1896,40 @@
                 <w:iCs/>
                 <w:color w:val="666666"/>
               </w:rPr>
-              <w:t xml:space="preserve">[Inserir aqui a captura da tela de confirmação do agendamento da versão publicada]</w:t>
+            </w:r>
+            <w:r>
+              <w:drawing>
+                <wp:inline xmlns:a="http://schemas.openxmlformats.org/drawingml/2006/main" xmlns:pic="http://schemas.openxmlformats.org/drawingml/2006/picture">
+                  <wp:extent cx="5040000" cy="5384658"/>
+                  <wp:docPr id="3" name="Picture 3"/>
+                  <wp:cNvGraphicFramePr>
+                    <a:graphicFrameLocks noChangeAspect="1"/>
+                  </wp:cNvGraphicFramePr>
+                  <a:graphic>
+                    <a:graphicData uri="http://schemas.openxmlformats.org/drawingml/2006/picture">
+                      <pic:pic>
+                        <pic:nvPicPr>
+                          <pic:cNvPr id="0" name="figura-2-confirmacao.png"/>
+                          <pic:cNvPicPr/>
+                        </pic:nvPicPr>
+                        <pic:blipFill>
+                          <a:blip r:embed="rId12"/>
+                          <a:stretch>
+                            <a:fillRect/>
+                          </a:stretch>
+                        </pic:blipFill>
+                        <pic:spPr>
+                          <a:xfrm>
+                            <a:off x="0" y="0"/>
+                            <a:ext cx="5040000" cy="5384658"/>
+                          </a:xfrm>
+                          <a:prstGeom prst="rect"/>
+                        </pic:spPr>
+                      </pic:pic>
+                    </a:graphicData>
+                  </a:graphic>
+                </wp:inline>
+              </w:drawing>
             </w:r>
           </w:p>
         </w:tc>
@@ -1972,7 +2030,40 @@
                 <w:iCs/>
                 <w:color w:val="666666"/>
               </w:rPr>
-              <w:t xml:space="preserve">[Inserir aqui a captura da tela de comprovante da versão publicada]</w:t>
+            </w:r>
+            <w:r>
+              <w:drawing>
+                <wp:inline xmlns:a="http://schemas.openxmlformats.org/drawingml/2006/main" xmlns:pic="http://schemas.openxmlformats.org/drawingml/2006/picture">
+                  <wp:extent cx="5040000" cy="4300733"/>
+                  <wp:docPr id="4" name="Picture 4"/>
+                  <wp:cNvGraphicFramePr>
+                    <a:graphicFrameLocks noChangeAspect="1"/>
+                  </wp:cNvGraphicFramePr>
+                  <a:graphic>
+                    <a:graphicData uri="http://schemas.openxmlformats.org/drawingml/2006/picture">
+                      <pic:pic>
+                        <pic:nvPicPr>
+                          <pic:cNvPr id="0" name="figura-3-comprovante.png"/>
+                          <pic:cNvPicPr/>
+                        </pic:nvPicPr>
+                        <pic:blipFill>
+                          <a:blip r:embed="rId13"/>
+                          <a:stretch>
+                            <a:fillRect/>
+                          </a:stretch>
+                        </pic:blipFill>
+                        <pic:spPr>
+                          <a:xfrm>
+                            <a:off x="0" y="0"/>
+                            <a:ext cx="5040000" cy="4300733"/>
+                          </a:xfrm>
+                          <a:prstGeom prst="rect"/>
+                        </pic:spPr>
+                      </pic:pic>
+                    </a:graphicData>
+                  </a:graphic>
+                </wp:inline>
+              </w:drawing>
             </w:r>
           </w:p>
         </w:tc>

</xml_diff>